<commit_message>
fix citation in intro, and equation numbering
</commit_message>
<xml_diff>
--- a/docs/chapter_downloads/Quintana_GoFish_Contaminant_Exposure.docx
+++ b/docs/chapter_downloads/Quintana_GoFish_Contaminant_Exposure.docx
@@ -1798,7 +1798,7 @@
               <m:nor/>
               <m:sty m:val="p"/>
             </m:rPr>
-            <m:t>(C.40)</m:t>
+            <m:t>(8.1)</m:t>
           </m:r>
         </m:oMath>
       </m:oMathPara>
@@ -2244,7 +2244,7 @@
               <m:nor/>
               <m:sty m:val="p"/>
             </m:rPr>
-            <m:t>(C.41)</m:t>
+            <m:t>(8.2)</m:t>
           </m:r>
         </m:oMath>
       </m:oMathPara>
@@ -2694,7 +2694,7 @@
               <m:nor/>
               <m:sty m:val="p"/>
             </m:rPr>
-            <m:t>(C.42)</m:t>
+            <m:t>(8.3)</m:t>
           </m:r>
         </m:oMath>
       </m:oMathPara>
@@ -3130,7 +3130,7 @@
               <m:nor/>
               <m:sty m:val="p"/>
             </m:rPr>
-            <m:t>(C.43)</m:t>
+            <m:t>(8.4)</m:t>
           </m:r>
         </m:oMath>
       </m:oMathPara>
@@ -3415,7 +3415,7 @@
               <m:nor/>
               <m:sty m:val="p"/>
             </m:rPr>
-            <m:t>(C.44)</m:t>
+            <m:t>(8.5)</m:t>
           </m:r>
         </m:oMath>
       </m:oMathPara>
@@ -3575,7 +3575,7 @@
               <m:nor/>
               <m:sty m:val="p"/>
             </m:rPr>
-            <m:t>(C.45)</m:t>
+            <m:t>(8.6)</m:t>
           </m:r>
         </m:oMath>
       </m:oMathPara>

</xml_diff>